<commit_message>
Add WordPress schema compatibility and auth updates
</commit_message>
<xml_diff>
--- a/docs/PyServer_User_Manual_2026-10-08.docx
+++ b/docs/PyServer_User_Manual_2026-10-08.docx
@@ -402,9 +402,8 @@
         <w:rPr/>
       </w:pPr>
       <w:r>
-        <w:t xml:space="preserve">Visitors can browse public content and create a Member account from Register. New registrations are members; an Admin can change a user's role in the Admin area.</w:t>
+        <w:t>Visitors can browse public content and create a Member account from Register. New registrations are members; an Admin can change a user's role in /py-admin. The first administrator is created during installation and can sign in with the email and password entered in the installer.</w:t>
       </w:r>
-      <w:r/>
     </w:p>
     <w:tbl>
       <w:tblPr>
@@ -645,9 +644,8 @@
         <w:rPr/>
       </w:pPr>
       <w:r>
-        <w:t xml:space="preserve">Use the Sign in page to authenticate. The Dashboard shows the account role, post totals, recent posts, and a link to change the account password. Passwords must be at least eight characters when registering or changing a password.</w:t>
+        <w:t>Use the Sign in page to authenticate. The Dashboard shows the account role, post totals, recent posts, and a link to change the account password. Strong passwords are required by default: at least 12 characters and at least three of lowercase, uppercase, numbers, and symbols. Registration, password change, and first-admin setup offer an unchecked confirmation to allow a weaker password; opting in still requires at least 8 characters.</w:t>
       </w:r>
-      <w:r/>
     </w:p>
     <w:p>
       <w:pPr>
@@ -972,9 +970,8 @@
         <w:rPr/>
       </w:pPr>
       <w:r>
-        <w:t xml:space="preserve">The account password form is at /account/password. Enter the current password, a new password, and its confirmation. Existing sessions are revoked when the password changes; the current browser receives a fresh session.</w:t>
+        <w:t>The account password form is at /account/password. Enter the current password, a new password, and its confirmation. Keep the weak-password confirmation unchecked unless you explicitly accept the risk. Existing sessions are revoked when the password changes; the current browser receives a fresh session.</w:t>
       </w:r>
-      <w:r/>
     </w:p>
     <w:p>
       <w:pPr>
@@ -1635,7 +1632,7 @@
         <w:rPr/>
       </w:pPr>
       <w:r>
-        <w:t>Posts, users, settings, and revisions are stored in the configured MySQL or MariaDB database. SQLite is retained for explicit local development and automated tests.</w:t>
+        <w:t>Posts, users, settings, and revisions are stored in the configured MySQL or MariaDB database. Application tables use the py_ prefix. SQLite is retained for explicit local development and automated tests.</w:t>
       </w:r>
     </w:p>
     <w:p>
@@ -1647,9 +1644,8 @@
         <w:rPr/>
       </w:pPr>
       <w:r>
-        <w:t xml:space="preserve">The app applies an additive migration to old posts tables. Make a backup before using important existing data with a new version.</w:t>
+        <w:t>Startup migrates old unprefixed PyServer tables and compatible wp_ tables into py_-prefixed tables without dropping source rows. Back up valuable databases before an upgrade.</w:t>
       </w:r>
-      <w:r/>
     </w:p>
     <w:p>
       <w:pPr>
@@ -2135,6 +2131,110 @@
     <w:p>
       <w:r>
         <w:t>The database account entered during setup must be allowed to create the database and access its tables. Keep instance/pyserver.json private because it stores the database connection password.</w:t>
+      </w:r>
+    </w:p>
+    <w:p>
+      <w:pPr>
+        <w:spacing w:before="320"/>
+      </w:pPr>
+      <w:r>
+        <w:rPr>
+          <w:b/>
+          <w:color w:val="175B50"/>
+          <w:sz w:val="36"/>
+        </w:rPr>
+        <w:t>10. WordPress-style database tables</w:t>
+      </w:r>
+    </w:p>
+    <w:p>
+      <w:r>
+        <w:t>PyServer creates and uses these core tables with the py_ prefix:</w:t>
+      </w:r>
+    </w:p>
+    <w:p>
+      <w:pPr>
+        <w:pStyle w:val="745"/>
+      </w:pPr>
+      <w:r>
+        <w:t>py_users and py_usermeta: accounts and user metadata.</w:t>
+      </w:r>
+    </w:p>
+    <w:p>
+      <w:pPr>
+        <w:pStyle w:val="745"/>
+      </w:pPr>
+      <w:r>
+        <w:t>py_posts and py_postmeta: posts, pages, content fields, and metadata. PyServer also stores revision history in py_post_revisions.</w:t>
+      </w:r>
+    </w:p>
+    <w:p>
+      <w:pPr>
+        <w:pStyle w:val="745"/>
+      </w:pPr>
+      <w:r>
+        <w:t>py_terms, py_term_taxonomy, py_term_relationships, and py_termmeta: terms, taxonomies, and content relationships.</w:t>
+      </w:r>
+    </w:p>
+    <w:p>
+      <w:pPr>
+        <w:pStyle w:val="745"/>
+      </w:pPr>
+      <w:r>
+        <w:t>py_comments and py_commentmeta: comments and comment metadata.</w:t>
+      </w:r>
+    </w:p>
+    <w:p>
+      <w:pPr>
+        <w:pStyle w:val="745"/>
+      </w:pPr>
+      <w:r>
+        <w:t>py_options: site options and settings.</w:t>
+      </w:r>
+    </w:p>
+    <w:p>
+      <w:pPr>
+        <w:pStyle w:val="745"/>
+      </w:pPr>
+      <w:r>
+        <w:t>py_links: link records.</w:t>
+      </w:r>
+    </w:p>
+    <w:p>
+      <w:r>
+        <w:t>On startup, migrations rename the app's legacy unprefixed tables. If matching wp_ tables exist and their py_ targets do not, they are renamed and compatibility fields are added so the existing users, posts, and options can be used by PyServer.</w:t>
+      </w:r>
+    </w:p>
+    <w:p>
+      <w:r>
+        <w:t>If the first administrator cannot sign in, verify the exact installer email and that the account is active. The installer-created PBKDF2 password is compatible with PyServer login; imported WordPress phpass credentials are upgraded after a successful sign-in. Back up the database before manual account recovery.</w:t>
+      </w:r>
+    </w:p>
+    <w:p>
+      <w:pPr>
+        <w:spacing w:before="320"/>
+      </w:pPr>
+      <w:r>
+        <w:rPr>
+          <w:b/>
+          <w:color w:val="175B50"/>
+          <w:sz w:val="36"/>
+        </w:rPr>
+        <w:t>11. WordPress import and password handling</w:t>
+      </w:r>
+    </w:p>
+    <w:p>
+      <w:r>
+        <w:t>Core application tables use a py_ prefix: py_users, py_usermeta, py_posts, py_postmeta, py_post_revisions, py_terms, py_term_taxonomy, py_term_relationships, py_termmeta, py_comments, py_commentmeta, py_options, and py_links. Existing unprefixed PyServer tables and eligible wp_ tables are migrated without dropping their rows.</w:t>
+      </w:r>
+    </w:p>
+    <w:p>
+      <w:r>
+        <w:t>During WordPress import, user capability metadata maps administrator and editor roles into PyServer roles. Existing WordPress portable phpass password hashes can authenticate; after a successful login they are upgraded to PyServer PBKDF2 hashes.</w:t>
+      </w:r>
+    </w:p>
+    <w:p>
+      <w:r>
+        <w:t>Strong passwords are mandatory unless the user explicitly checks the weak-password confirmation. With that confirmation, passwords must still be at least eight characters. The checkbox is unchecked by default on registration, first-admin setup, and password changes.</w:t>
       </w:r>
     </w:p>
     <w:sectPr>

</xml_diff>